<commit_message>
Add Thesis_Documentation (beginner replicate-from-scratch guide); register Module 07
</commit_message>
<xml_diff>
--- a/results/03_cppo_vs_ppo_results.docx
+++ b/results/03_cppo_vs_ppo_results.docx
@@ -331,7 +331,7 @@
                 <w:sz w:val="28"/>
                 <w:szCs w:val="28"/>
               </w:rPr>
-              <w:t xml:space="preserve">—</w:t>
+              <w:t xml:space="preserve">166.3</w:t>
             </w:r>
           </w:p>
         </w:tc>
@@ -423,7 +423,7 @@
                 <w:sz w:val="28"/>
                 <w:szCs w:val="28"/>
               </w:rPr>
-              <w:t xml:space="preserve">—</w:t>
+              <w:t xml:space="preserve">2.24</w:t>
             </w:r>
           </w:p>
         </w:tc>
@@ -515,7 +515,7 @@
                 <w:sz w:val="28"/>
                 <w:szCs w:val="28"/>
               </w:rPr>
-              <w:t xml:space="preserve">—</w:t>
+              <w:t xml:space="preserve">0.0</w:t>
             </w:r>
           </w:p>
         </w:tc>
@@ -607,7 +607,7 @@
                 <w:sz w:val="28"/>
                 <w:szCs w:val="28"/>
               </w:rPr>
-              <w:t xml:space="preserve">—</w:t>
+              <w:t xml:space="preserve">6.65</w:t>
             </w:r>
           </w:p>
         </w:tc>
@@ -806,6 +806,24 @@
     <w:p>
       <w:pPr>
         <w:spacing w:after="0" w:before="200" w:line="300"/>
+        <w:jc w:val="both"/>
+      </w:pPr>
+      <w:r>
+        <w:rPr>
+          <w:rFonts w:ascii="Times New Roman" w:cs="Times New Roman" w:eastAsia="Times New Roman" w:hAnsi="Times New Roman"/>
+          <w:b w:val="false"/>
+          <w:bCs w:val="false"/>
+          <w:i/>
+          <w:iCs/>
+          <w:sz w:val="22"/>
+          <w:szCs w:val="22"/>
+        </w:rPr>
+        <w:t xml:space="preserve">cPPO Lagrangian dynamics (1500 iters, num_envs=4096): mean episodic cost peaked ≈ 80.2 before the constraint drove it to 2.24 — well under the cost_limit = 25 budget; cost λ rose to a 16.7 peak (cap 100, never railed) then relaxed to 0 once cost fell under budget; and the singularity-violation rate fell from a 51.7% peak to 6.65% (below the ~20% unconstrained baseline). PPO column to be filled from the matched unconstrained run.</w:t>
+      </w:r>
+    </w:p>
+    <w:p>
+      <w:pPr>
+        <w:spacing w:after="0" w:before="120" w:line="300"/>
         <w:jc w:val="both"/>
       </w:pPr>
       <w:r>

</xml_diff>

<commit_message>
Module 03: cPPO vs PPO benchmark complete — success eval, results table, write-up, TB CSVs
</commit_message>
<xml_diff>
--- a/results/03_cppo_vs_ppo_results.docx
+++ b/results/03_cppo_vs_ppo_results.docx
@@ -179,67 +179,67 @@
                 <w:sz w:val="28"/>
                 <w:szCs w:val="28"/>
               </w:rPr>
-              <w:t xml:space="preserve">Success rate (%)</w:t>
-            </w:r>
-          </w:p>
-        </w:tc>
-        <w:tc>
-          <w:tcPr>
-            <w:tcW w:type="dxa" w:w="2900"/>
-            <w:tcMar>
-              <w:top w:type="dxa" w:w="60"/>
-              <w:left w:type="dxa" w:w="110"/>
-              <w:bottom w:type="dxa" w:w="60"/>
-              <w:right w:type="dxa" w:w="110"/>
-            </w:tcMar>
-            <w:vAlign w:val="center"/>
-          </w:tcPr>
-          <w:p>
-            <w:pPr>
-              <w:spacing w:after="20" w:before="20" w:line="300"/>
-              <w:jc w:val="center"/>
-            </w:pPr>
-            <w:r>
-              <w:rPr>
-                <w:rFonts w:ascii="Times New Roman" w:cs="Times New Roman" w:eastAsia="Times New Roman" w:hAnsi="Times New Roman"/>
-                <w:b w:val="false"/>
-                <w:bCs w:val="false"/>
-                <w:i w:val="false"/>
-                <w:iCs w:val="false"/>
-                <w:sz w:val="28"/>
-                <w:szCs w:val="28"/>
-              </w:rPr>
-              <w:t xml:space="preserve">—</w:t>
-            </w:r>
-          </w:p>
-        </w:tc>
-        <w:tc>
-          <w:tcPr>
-            <w:tcW w:type="dxa" w:w="2900"/>
-            <w:tcMar>
-              <w:top w:type="dxa" w:w="60"/>
-              <w:left w:type="dxa" w:w="110"/>
-              <w:bottom w:type="dxa" w:w="60"/>
-              <w:right w:type="dxa" w:w="110"/>
-            </w:tcMar>
-            <w:vAlign w:val="center"/>
-          </w:tcPr>
-          <w:p>
-            <w:pPr>
-              <w:spacing w:after="20" w:before="20" w:line="300"/>
-              <w:jc w:val="center"/>
-            </w:pPr>
-            <w:r>
-              <w:rPr>
-                <w:rFonts w:ascii="Times New Roman" w:cs="Times New Roman" w:eastAsia="Times New Roman" w:hAnsi="Times New Roman"/>
-                <w:b w:val="false"/>
-                <w:bCs w:val="false"/>
-                <w:i w:val="false"/>
-                <w:iCs w:val="false"/>
-                <w:sz w:val="28"/>
-                <w:szCs w:val="28"/>
-              </w:rPr>
-              <w:t xml:space="preserve">—</w:t>
+              <w:t xml:space="preserve">Lift success (%)</w:t>
+            </w:r>
+          </w:p>
+        </w:tc>
+        <w:tc>
+          <w:tcPr>
+            <w:tcW w:type="dxa" w:w="2900"/>
+            <w:tcMar>
+              <w:top w:type="dxa" w:w="60"/>
+              <w:left w:type="dxa" w:w="110"/>
+              <w:bottom w:type="dxa" w:w="60"/>
+              <w:right w:type="dxa" w:w="110"/>
+            </w:tcMar>
+            <w:vAlign w:val="center"/>
+          </w:tcPr>
+          <w:p>
+            <w:pPr>
+              <w:spacing w:after="20" w:before="20" w:line="300"/>
+              <w:jc w:val="center"/>
+            </w:pPr>
+            <w:r>
+              <w:rPr>
+                <w:rFonts w:ascii="Times New Roman" w:cs="Times New Roman" w:eastAsia="Times New Roman" w:hAnsi="Times New Roman"/>
+                <w:b w:val="false"/>
+                <w:bCs w:val="false"/>
+                <w:i w:val="false"/>
+                <w:iCs w:val="false"/>
+                <w:sz w:val="28"/>
+                <w:szCs w:val="28"/>
+              </w:rPr>
+              <w:t xml:space="preserve">100.0</w:t>
+            </w:r>
+          </w:p>
+        </w:tc>
+        <w:tc>
+          <w:tcPr>
+            <w:tcW w:type="dxa" w:w="2900"/>
+            <w:tcMar>
+              <w:top w:type="dxa" w:w="60"/>
+              <w:left w:type="dxa" w:w="110"/>
+              <w:bottom w:type="dxa" w:w="60"/>
+              <w:right w:type="dxa" w:w="110"/>
+            </w:tcMar>
+            <w:vAlign w:val="center"/>
+          </w:tcPr>
+          <w:p>
+            <w:pPr>
+              <w:spacing w:after="20" w:before="20" w:line="300"/>
+              <w:jc w:val="center"/>
+            </w:pPr>
+            <w:r>
+              <w:rPr>
+                <w:rFonts w:ascii="Times New Roman" w:cs="Times New Roman" w:eastAsia="Times New Roman" w:hAnsi="Times New Roman"/>
+                <w:b w:val="false"/>
+                <w:bCs w:val="false"/>
+                <w:i w:val="false"/>
+                <w:iCs w:val="false"/>
+                <w:sz w:val="28"/>
+                <w:szCs w:val="28"/>
+              </w:rPr>
+              <w:t xml:space="preserve">100.0</w:t>
             </w:r>
           </w:p>
         </w:tc>
@@ -271,67 +271,67 @@
                 <w:sz w:val="28"/>
                 <w:szCs w:val="28"/>
               </w:rPr>
-              <w:t xml:space="preserve">Final mean reward</w:t>
-            </w:r>
-          </w:p>
-        </w:tc>
-        <w:tc>
-          <w:tcPr>
-            <w:tcW w:type="dxa" w:w="2900"/>
-            <w:tcMar>
-              <w:top w:type="dxa" w:w="60"/>
-              <w:left w:type="dxa" w:w="110"/>
-              <w:bottom w:type="dxa" w:w="60"/>
-              <w:right w:type="dxa" w:w="110"/>
-            </w:tcMar>
-            <w:vAlign w:val="center"/>
-          </w:tcPr>
-          <w:p>
-            <w:pPr>
-              <w:spacing w:after="20" w:before="20" w:line="300"/>
-              <w:jc w:val="center"/>
-            </w:pPr>
-            <w:r>
-              <w:rPr>
-                <w:rFonts w:ascii="Times New Roman" w:cs="Times New Roman" w:eastAsia="Times New Roman" w:hAnsi="Times New Roman"/>
-                <w:b w:val="false"/>
-                <w:bCs w:val="false"/>
-                <w:i w:val="false"/>
-                <w:iCs w:val="false"/>
-                <w:sz w:val="28"/>
-                <w:szCs w:val="28"/>
-              </w:rPr>
-              <w:t xml:space="preserve">—</w:t>
-            </w:r>
-          </w:p>
-        </w:tc>
-        <w:tc>
-          <w:tcPr>
-            <w:tcW w:type="dxa" w:w="2900"/>
-            <w:tcMar>
-              <w:top w:type="dxa" w:w="60"/>
-              <w:left w:type="dxa" w:w="110"/>
-              <w:bottom w:type="dxa" w:w="60"/>
-              <w:right w:type="dxa" w:w="110"/>
-            </w:tcMar>
-            <w:vAlign w:val="center"/>
-          </w:tcPr>
-          <w:p>
-            <w:pPr>
-              <w:spacing w:after="20" w:before="20" w:line="300"/>
-              <w:jc w:val="center"/>
-            </w:pPr>
-            <w:r>
-              <w:rPr>
-                <w:rFonts w:ascii="Times New Roman" w:cs="Times New Roman" w:eastAsia="Times New Roman" w:hAnsi="Times New Roman"/>
-                <w:b w:val="false"/>
-                <w:bCs w:val="false"/>
-                <w:i w:val="false"/>
-                <w:iCs w:val="false"/>
-                <w:sz w:val="28"/>
-                <w:szCs w:val="28"/>
-              </w:rPr>
-              <w:t xml:space="preserve">166.3</w:t>
+              <w:t xml:space="preserve">Goal-reach success (%)</w:t>
+            </w:r>
+          </w:p>
+        </w:tc>
+        <w:tc>
+          <w:tcPr>
+            <w:tcW w:type="dxa" w:w="2900"/>
+            <w:tcMar>
+              <w:top w:type="dxa" w:w="60"/>
+              <w:left w:type="dxa" w:w="110"/>
+              <w:bottom w:type="dxa" w:w="60"/>
+              <w:right w:type="dxa" w:w="110"/>
+            </w:tcMar>
+            <w:vAlign w:val="center"/>
+          </w:tcPr>
+          <w:p>
+            <w:pPr>
+              <w:spacing w:after="20" w:before="20" w:line="300"/>
+              <w:jc w:val="center"/>
+            </w:pPr>
+            <w:r>
+              <w:rPr>
+                <w:rFonts w:ascii="Times New Roman" w:cs="Times New Roman" w:eastAsia="Times New Roman" w:hAnsi="Times New Roman"/>
+                <w:b w:val="false"/>
+                <w:bCs w:val="false"/>
+                <w:i w:val="false"/>
+                <w:iCs w:val="false"/>
+                <w:sz w:val="28"/>
+                <w:szCs w:val="28"/>
+              </w:rPr>
+              <w:t xml:space="preserve">100.0</w:t>
+            </w:r>
+          </w:p>
+        </w:tc>
+        <w:tc>
+          <w:tcPr>
+            <w:tcW w:type="dxa" w:w="2900"/>
+            <w:tcMar>
+              <w:top w:type="dxa" w:w="60"/>
+              <w:left w:type="dxa" w:w="110"/>
+              <w:bottom w:type="dxa" w:w="60"/>
+              <w:right w:type="dxa" w:w="110"/>
+            </w:tcMar>
+            <w:vAlign w:val="center"/>
+          </w:tcPr>
+          <w:p>
+            <w:pPr>
+              <w:spacing w:after="20" w:before="20" w:line="300"/>
+              <w:jc w:val="center"/>
+            </w:pPr>
+            <w:r>
+              <w:rPr>
+                <w:rFonts w:ascii="Times New Roman" w:cs="Times New Roman" w:eastAsia="Times New Roman" w:hAnsi="Times New Roman"/>
+                <w:b w:val="false"/>
+                <w:bCs w:val="false"/>
+                <w:i w:val="false"/>
+                <w:iCs w:val="false"/>
+                <w:sz w:val="28"/>
+                <w:szCs w:val="28"/>
+              </w:rPr>
+              <w:t xml:space="preserve">99.6</w:t>
             </w:r>
           </w:p>
         </w:tc>
@@ -363,67 +363,67 @@
                 <w:sz w:val="28"/>
                 <w:szCs w:val="28"/>
               </w:rPr>
-              <w:t xml:space="preserve">Mean episodic cost</w:t>
-            </w:r>
-          </w:p>
-        </w:tc>
-        <w:tc>
-          <w:tcPr>
-            <w:tcW w:type="dxa" w:w="2900"/>
-            <w:tcMar>
-              <w:top w:type="dxa" w:w="60"/>
-              <w:left w:type="dxa" w:w="110"/>
-              <w:bottom w:type="dxa" w:w="60"/>
-              <w:right w:type="dxa" w:w="110"/>
-            </w:tcMar>
-            <w:vAlign w:val="center"/>
-          </w:tcPr>
-          <w:p>
-            <w:pPr>
-              <w:spacing w:after="20" w:before="20" w:line="300"/>
-              <w:jc w:val="center"/>
-            </w:pPr>
-            <w:r>
-              <w:rPr>
-                <w:rFonts w:ascii="Times New Roman" w:cs="Times New Roman" w:eastAsia="Times New Roman" w:hAnsi="Times New Roman"/>
-                <w:b w:val="false"/>
-                <w:bCs w:val="false"/>
-                <w:i w:val="false"/>
-                <w:iCs w:val="false"/>
-                <w:sz w:val="28"/>
-                <w:szCs w:val="28"/>
-              </w:rPr>
-              <w:t xml:space="preserve">—</w:t>
-            </w:r>
-          </w:p>
-        </w:tc>
-        <w:tc>
-          <w:tcPr>
-            <w:tcW w:type="dxa" w:w="2900"/>
-            <w:tcMar>
-              <w:top w:type="dxa" w:w="60"/>
-              <w:left w:type="dxa" w:w="110"/>
-              <w:bottom w:type="dxa" w:w="60"/>
-              <w:right w:type="dxa" w:w="110"/>
-            </w:tcMar>
-            <w:vAlign w:val="center"/>
-          </w:tcPr>
-          <w:p>
-            <w:pPr>
-              <w:spacing w:after="20" w:before="20" w:line="300"/>
-              <w:jc w:val="center"/>
-            </w:pPr>
-            <w:r>
-              <w:rPr>
-                <w:rFonts w:ascii="Times New Roman" w:cs="Times New Roman" w:eastAsia="Times New Roman" w:hAnsi="Times New Roman"/>
-                <w:b w:val="false"/>
-                <w:bCs w:val="false"/>
-                <w:i w:val="false"/>
-                <w:iCs w:val="false"/>
-                <w:sz w:val="28"/>
-                <w:szCs w:val="28"/>
-              </w:rPr>
-              <w:t xml:space="preserve">2.24</w:t>
+              <w:t xml:space="preserve">Final mean reward</w:t>
+            </w:r>
+          </w:p>
+        </w:tc>
+        <w:tc>
+          <w:tcPr>
+            <w:tcW w:type="dxa" w:w="2900"/>
+            <w:tcMar>
+              <w:top w:type="dxa" w:w="60"/>
+              <w:left w:type="dxa" w:w="110"/>
+              <w:bottom w:type="dxa" w:w="60"/>
+              <w:right w:type="dxa" w:w="110"/>
+            </w:tcMar>
+            <w:vAlign w:val="center"/>
+          </w:tcPr>
+          <w:p>
+            <w:pPr>
+              <w:spacing w:after="20" w:before="20" w:line="300"/>
+              <w:jc w:val="center"/>
+            </w:pPr>
+            <w:r>
+              <w:rPr>
+                <w:rFonts w:ascii="Times New Roman" w:cs="Times New Roman" w:eastAsia="Times New Roman" w:hAnsi="Times New Roman"/>
+                <w:b w:val="false"/>
+                <w:bCs w:val="false"/>
+                <w:i w:val="false"/>
+                <w:iCs w:val="false"/>
+                <w:sz w:val="28"/>
+                <w:szCs w:val="28"/>
+              </w:rPr>
+              <w:t xml:space="preserve">167.2</w:t>
+            </w:r>
+          </w:p>
+        </w:tc>
+        <w:tc>
+          <w:tcPr>
+            <w:tcW w:type="dxa" w:w="2900"/>
+            <w:tcMar>
+              <w:top w:type="dxa" w:w="60"/>
+              <w:left w:type="dxa" w:w="110"/>
+              <w:bottom w:type="dxa" w:w="60"/>
+              <w:right w:type="dxa" w:w="110"/>
+            </w:tcMar>
+            <w:vAlign w:val="center"/>
+          </w:tcPr>
+          <w:p>
+            <w:pPr>
+              <w:spacing w:after="20" w:before="20" w:line="300"/>
+              <w:jc w:val="center"/>
+            </w:pPr>
+            <w:r>
+              <w:rPr>
+                <w:rFonts w:ascii="Times New Roman" w:cs="Times New Roman" w:eastAsia="Times New Roman" w:hAnsi="Times New Roman"/>
+                <w:b w:val="false"/>
+                <w:bCs w:val="false"/>
+                <w:i w:val="false"/>
+                <w:iCs w:val="false"/>
+                <w:sz w:val="28"/>
+                <w:szCs w:val="28"/>
+              </w:rPr>
+              <w:t xml:space="preserve">166.3</w:t>
             </w:r>
           </w:p>
         </w:tc>
@@ -455,67 +455,67 @@
                 <w:sz w:val="28"/>
                 <w:szCs w:val="28"/>
               </w:rPr>
-              <w:t xml:space="preserve">Cost λ (final)</w:t>
-            </w:r>
-          </w:p>
-        </w:tc>
-        <w:tc>
-          <w:tcPr>
-            <w:tcW w:type="dxa" w:w="2900"/>
-            <w:tcMar>
-              <w:top w:type="dxa" w:w="60"/>
-              <w:left w:type="dxa" w:w="110"/>
-              <w:bottom w:type="dxa" w:w="60"/>
-              <w:right w:type="dxa" w:w="110"/>
-            </w:tcMar>
-            <w:vAlign w:val="center"/>
-          </w:tcPr>
-          <w:p>
-            <w:pPr>
-              <w:spacing w:after="20" w:before="20" w:line="300"/>
-              <w:jc w:val="center"/>
-            </w:pPr>
-            <w:r>
-              <w:rPr>
-                <w:rFonts w:ascii="Times New Roman" w:cs="Times New Roman" w:eastAsia="Times New Roman" w:hAnsi="Times New Roman"/>
-                <w:b w:val="false"/>
-                <w:bCs w:val="false"/>
-                <w:i w:val="false"/>
-                <w:iCs w:val="false"/>
-                <w:sz w:val="28"/>
-                <w:szCs w:val="28"/>
-              </w:rPr>
-              <w:t xml:space="preserve">—</w:t>
-            </w:r>
-          </w:p>
-        </w:tc>
-        <w:tc>
-          <w:tcPr>
-            <w:tcW w:type="dxa" w:w="2900"/>
-            <w:tcMar>
-              <w:top w:type="dxa" w:w="60"/>
-              <w:left w:type="dxa" w:w="110"/>
-              <w:bottom w:type="dxa" w:w="60"/>
-              <w:right w:type="dxa" w:w="110"/>
-            </w:tcMar>
-            <w:vAlign w:val="center"/>
-          </w:tcPr>
-          <w:p>
-            <w:pPr>
-              <w:spacing w:after="20" w:before="20" w:line="300"/>
-              <w:jc w:val="center"/>
-            </w:pPr>
-            <w:r>
-              <w:rPr>
-                <w:rFonts w:ascii="Times New Roman" w:cs="Times New Roman" w:eastAsia="Times New Roman" w:hAnsi="Times New Roman"/>
-                <w:b w:val="false"/>
-                <w:bCs w:val="false"/>
-                <w:i w:val="false"/>
-                <w:iCs w:val="false"/>
-                <w:sz w:val="28"/>
-                <w:szCs w:val="28"/>
-              </w:rPr>
-              <w:t xml:space="preserve">0.0</w:t>
+              <w:t xml:space="preserve">Singularity violation rate (%)</w:t>
+            </w:r>
+          </w:p>
+        </w:tc>
+        <w:tc>
+          <w:tcPr>
+            <w:tcW w:type="dxa" w:w="2900"/>
+            <w:tcMar>
+              <w:top w:type="dxa" w:w="60"/>
+              <w:left w:type="dxa" w:w="110"/>
+              <w:bottom w:type="dxa" w:w="60"/>
+              <w:right w:type="dxa" w:w="110"/>
+            </w:tcMar>
+            <w:vAlign w:val="center"/>
+          </w:tcPr>
+          <w:p>
+            <w:pPr>
+              <w:spacing w:after="20" w:before="20" w:line="300"/>
+              <w:jc w:val="center"/>
+            </w:pPr>
+            <w:r>
+              <w:rPr>
+                <w:rFonts w:ascii="Times New Roman" w:cs="Times New Roman" w:eastAsia="Times New Roman" w:hAnsi="Times New Roman"/>
+                <w:b w:val="false"/>
+                <w:bCs w:val="false"/>
+                <w:i w:val="false"/>
+                <w:iCs w:val="false"/>
+                <w:sz w:val="28"/>
+                <w:szCs w:val="28"/>
+              </w:rPr>
+              <w:t xml:space="preserve">16.86</w:t>
+            </w:r>
+          </w:p>
+        </w:tc>
+        <w:tc>
+          <w:tcPr>
+            <w:tcW w:type="dxa" w:w="2900"/>
+            <w:tcMar>
+              <w:top w:type="dxa" w:w="60"/>
+              <w:left w:type="dxa" w:w="110"/>
+              <w:bottom w:type="dxa" w:w="60"/>
+              <w:right w:type="dxa" w:w="110"/>
+            </w:tcMar>
+            <w:vAlign w:val="center"/>
+          </w:tcPr>
+          <w:p>
+            <w:pPr>
+              <w:spacing w:after="20" w:before="20" w:line="300"/>
+              <w:jc w:val="center"/>
+            </w:pPr>
+            <w:r>
+              <w:rPr>
+                <w:rFonts w:ascii="Times New Roman" w:cs="Times New Roman" w:eastAsia="Times New Roman" w:hAnsi="Times New Roman"/>
+                <w:b w:val="false"/>
+                <w:bCs w:val="false"/>
+                <w:i w:val="false"/>
+                <w:iCs w:val="false"/>
+                <w:sz w:val="28"/>
+                <w:szCs w:val="28"/>
+              </w:rPr>
+              <w:t xml:space="preserve">6.65</w:t>
             </w:r>
           </w:p>
         </w:tc>
@@ -547,67 +547,67 @@
                 <w:sz w:val="28"/>
                 <w:szCs w:val="28"/>
               </w:rPr>
-              <w:t xml:space="preserve">Singularity violation rate (%)</w:t>
-            </w:r>
-          </w:p>
-        </w:tc>
-        <w:tc>
-          <w:tcPr>
-            <w:tcW w:type="dxa" w:w="2900"/>
-            <w:tcMar>
-              <w:top w:type="dxa" w:w="60"/>
-              <w:left w:type="dxa" w:w="110"/>
-              <w:bottom w:type="dxa" w:w="60"/>
-              <w:right w:type="dxa" w:w="110"/>
-            </w:tcMar>
-            <w:vAlign w:val="center"/>
-          </w:tcPr>
-          <w:p>
-            <w:pPr>
-              <w:spacing w:after="20" w:before="20" w:line="300"/>
-              <w:jc w:val="center"/>
-            </w:pPr>
-            <w:r>
-              <w:rPr>
-                <w:rFonts w:ascii="Times New Roman" w:cs="Times New Roman" w:eastAsia="Times New Roman" w:hAnsi="Times New Roman"/>
-                <w:b w:val="false"/>
-                <w:bCs w:val="false"/>
-                <w:i w:val="false"/>
-                <w:iCs w:val="false"/>
-                <w:sz w:val="28"/>
-                <w:szCs w:val="28"/>
-              </w:rPr>
-              <w:t xml:space="preserve">—</w:t>
-            </w:r>
-          </w:p>
-        </w:tc>
-        <w:tc>
-          <w:tcPr>
-            <w:tcW w:type="dxa" w:w="2900"/>
-            <w:tcMar>
-              <w:top w:type="dxa" w:w="60"/>
-              <w:left w:type="dxa" w:w="110"/>
-              <w:bottom w:type="dxa" w:w="60"/>
-              <w:right w:type="dxa" w:w="110"/>
-            </w:tcMar>
-            <w:vAlign w:val="center"/>
-          </w:tcPr>
-          <w:p>
-            <w:pPr>
-              <w:spacing w:after="20" w:before="20" w:line="300"/>
-              <w:jc w:val="center"/>
-            </w:pPr>
-            <w:r>
-              <w:rPr>
-                <w:rFonts w:ascii="Times New Roman" w:cs="Times New Roman" w:eastAsia="Times New Roman" w:hAnsi="Times New Roman"/>
-                <w:b w:val="false"/>
-                <w:bCs w:val="false"/>
-                <w:i w:val="false"/>
-                <w:iCs w:val="false"/>
-                <w:sz w:val="28"/>
-                <w:szCs w:val="28"/>
-              </w:rPr>
-              <w:t xml:space="preserve">6.65</w:t>
+              <w:t xml:space="preserve">Mean safety cost, per step</w:t>
+            </w:r>
+          </w:p>
+        </w:tc>
+        <w:tc>
+          <w:tcPr>
+            <w:tcW w:type="dxa" w:w="2900"/>
+            <w:tcMar>
+              <w:top w:type="dxa" w:w="60"/>
+              <w:left w:type="dxa" w:w="110"/>
+              <w:bottom w:type="dxa" w:w="60"/>
+              <w:right w:type="dxa" w:w="110"/>
+            </w:tcMar>
+            <w:vAlign w:val="center"/>
+          </w:tcPr>
+          <w:p>
+            <w:pPr>
+              <w:spacing w:after="20" w:before="20" w:line="300"/>
+              <w:jc w:val="center"/>
+            </w:pPr>
+            <w:r>
+              <w:rPr>
+                <w:rFonts w:ascii="Times New Roman" w:cs="Times New Roman" w:eastAsia="Times New Roman" w:hAnsi="Times New Roman"/>
+                <w:b w:val="false"/>
+                <w:bCs w:val="false"/>
+                <w:i w:val="false"/>
+                <w:iCs w:val="false"/>
+                <w:sz w:val="28"/>
+                <w:szCs w:val="28"/>
+              </w:rPr>
+              <w:t xml:space="preserve">0.0201</w:t>
+            </w:r>
+          </w:p>
+        </w:tc>
+        <w:tc>
+          <w:tcPr>
+            <w:tcW w:type="dxa" w:w="2900"/>
+            <w:tcMar>
+              <w:top w:type="dxa" w:w="60"/>
+              <w:left w:type="dxa" w:w="110"/>
+              <w:bottom w:type="dxa" w:w="60"/>
+              <w:right w:type="dxa" w:w="110"/>
+            </w:tcMar>
+            <w:vAlign w:val="center"/>
+          </w:tcPr>
+          <w:p>
+            <w:pPr>
+              <w:spacing w:after="20" w:before="20" w:line="300"/>
+              <w:jc w:val="center"/>
+            </w:pPr>
+            <w:r>
+              <w:rPr>
+                <w:rFonts w:ascii="Times New Roman" w:cs="Times New Roman" w:eastAsia="Times New Roman" w:hAnsi="Times New Roman"/>
+                <w:b w:val="false"/>
+                <w:bCs w:val="false"/>
+                <w:i w:val="false"/>
+                <w:iCs w:val="false"/>
+                <w:sz w:val="28"/>
+                <w:szCs w:val="28"/>
+              </w:rPr>
+              <w:t xml:space="preserve">0.0149</w:t>
             </w:r>
           </w:p>
         </w:tc>
@@ -616,6 +616,98 @@
         <w:tc>
           <w:tcPr>
             <w:tcW w:type="dxa" w:w="3560"/>
+            <w:tcMar>
+              <w:top w:type="dxa" w:w="60"/>
+              <w:left w:type="dxa" w:w="110"/>
+              <w:bottom w:type="dxa" w:w="60"/>
+              <w:right w:type="dxa" w:w="110"/>
+            </w:tcMar>
+            <w:vAlign w:val="center"/>
+          </w:tcPr>
+          <w:p>
+            <w:pPr>
+              <w:spacing w:after="20" w:before="20" w:line="300"/>
+              <w:jc w:val="left"/>
+            </w:pPr>
+            <w:r>
+              <w:rPr>
+                <w:rFonts w:ascii="Times New Roman" w:cs="Times New Roman" w:eastAsia="Times New Roman" w:hAnsi="Times New Roman"/>
+                <w:b w:val="false"/>
+                <w:bCs w:val="false"/>
+                <w:i w:val="false"/>
+                <w:iCs w:val="false"/>
+                <w:sz w:val="28"/>
+                <w:szCs w:val="28"/>
+              </w:rPr>
+              <w:t xml:space="preserve">Cost λ, final ‡</w:t>
+            </w:r>
+          </w:p>
+        </w:tc>
+        <w:tc>
+          <w:tcPr>
+            <w:tcW w:type="dxa" w:w="2900"/>
+            <w:tcMar>
+              <w:top w:type="dxa" w:w="60"/>
+              <w:left w:type="dxa" w:w="110"/>
+              <w:bottom w:type="dxa" w:w="60"/>
+              <w:right w:type="dxa" w:w="110"/>
+            </w:tcMar>
+            <w:vAlign w:val="center"/>
+          </w:tcPr>
+          <w:p>
+            <w:pPr>
+              <w:spacing w:after="20" w:before="20" w:line="300"/>
+              <w:jc w:val="center"/>
+            </w:pPr>
+            <w:r>
+              <w:rPr>
+                <w:rFonts w:ascii="Times New Roman" w:cs="Times New Roman" w:eastAsia="Times New Roman" w:hAnsi="Times New Roman"/>
+                <w:b w:val="false"/>
+                <w:bCs w:val="false"/>
+                <w:i w:val="false"/>
+                <w:iCs w:val="false"/>
+                <w:sz w:val="28"/>
+                <w:szCs w:val="28"/>
+              </w:rPr>
+              <w:t xml:space="preserve">N/A</w:t>
+            </w:r>
+          </w:p>
+        </w:tc>
+        <w:tc>
+          <w:tcPr>
+            <w:tcW w:type="dxa" w:w="2900"/>
+            <w:tcMar>
+              <w:top w:type="dxa" w:w="60"/>
+              <w:left w:type="dxa" w:w="110"/>
+              <w:bottom w:type="dxa" w:w="60"/>
+              <w:right w:type="dxa" w:w="110"/>
+            </w:tcMar>
+            <w:vAlign w:val="center"/>
+          </w:tcPr>
+          <w:p>
+            <w:pPr>
+              <w:spacing w:after="20" w:before="20" w:line="300"/>
+              <w:jc w:val="center"/>
+            </w:pPr>
+            <w:r>
+              <w:rPr>
+                <w:rFonts w:ascii="Times New Roman" w:cs="Times New Roman" w:eastAsia="Times New Roman" w:hAnsi="Times New Roman"/>
+                <w:b w:val="false"/>
+                <w:bCs w:val="false"/>
+                <w:i w:val="false"/>
+                <w:iCs w:val="false"/>
+                <w:sz w:val="28"/>
+                <w:szCs w:val="28"/>
+              </w:rPr>
+              <w:t xml:space="preserve">0.0</w:t>
+            </w:r>
+          </w:p>
+        </w:tc>
+      </w:tr>
+      <w:tr>
+        <w:tc>
+          <w:tcPr>
+            <w:tcW w:type="dxa" w:w="3560"/>
             <w:shd w:fill="EAEFF7" w:color="auto" w:val="clear"/>
             <w:tcMar>
               <w:top w:type="dxa" w:w="60"/>
@@ -671,7 +763,7 @@
                 <w:sz w:val="28"/>
                 <w:szCs w:val="28"/>
               </w:rPr>
-              <w:t xml:space="preserve">—</w:t>
+              <w:t xml:space="preserve">0.0</w:t>
             </w:r>
           </w:p>
         </w:tc>
@@ -702,7 +794,7 @@
                 <w:sz w:val="28"/>
                 <w:szCs w:val="28"/>
               </w:rPr>
-              <w:t xml:space="preserve">—</w:t>
+              <w:t xml:space="preserve">0.0</w:t>
             </w:r>
           </w:p>
         </w:tc>
@@ -766,7 +858,7 @@
                 <w:sz w:val="28"/>
                 <w:szCs w:val="28"/>
               </w:rPr>
-              <w:t xml:space="preserve">—</w:t>
+              <w:t xml:space="preserve">0.0</w:t>
             </w:r>
           </w:p>
         </w:tc>
@@ -797,7 +889,7 @@
                 <w:sz w:val="28"/>
                 <w:szCs w:val="28"/>
               </w:rPr>
-              <w:t xml:space="preserve">—</w:t>
+              <w:t xml:space="preserve">0.0</w:t>
             </w:r>
           </w:p>
         </w:tc>
@@ -818,7 +910,7 @@
           <w:sz w:val="22"/>
           <w:szCs w:val="22"/>
         </w:rPr>
-        <w:t xml:space="preserve">cPPO Lagrangian dynamics (1500 iters, num_envs=4096): mean episodic cost peaked ≈ 80.2 before the constraint drove it to 2.24 — well under the cost_limit = 25 budget; cost λ rose to a 16.7 peak (cap 100, never railed) then relaxed to 0 once cost fell under budget; and the singularity-violation rate fell from a 51.7% peak to 6.65% (below the ~20% unconstrained baseline). PPO column to be filled from the matched unconstrained run.</w:t>
+        <w:t xml:space="preserve">Headline: cPPO matches PPO on task performance — both lift the cube on ~100% of 512 evaluation episodes and reach near-identical reward (166.3 vs 167.2) — while cutting time in near-singular poses by ~60% (singularity violation 6.65% vs 16.86%). Safety at essentially no task cost. cPPO Lagrangian dynamics (1500 iters, num_envs=4096): mean episodic cost peaked ≈ 80.2 before the constraint drove it to 2.24, well under the cost_limit = 25 budget; cost λ rose to a 16.7 peak (cap 100, never railed) then relaxed to 0 once cost fell under budget.</w:t>
       </w:r>
     </w:p>
     <w:p>
@@ -836,7 +928,7 @@
           <w:sz w:val="22"/>
           <w:szCs w:val="22"/>
         </w:rPr>
-        <w:t xml:space="preserve">† Monitored-but-satisfied constraints (inactive by construction in this tabletop workspace: baseline joint-limit clearance ≥ 1.39 rad, link height ≥ 0.125 m). Reported for honesty; expected ≈ 0 for both agents. Delete these two rows if not needed.</w:t>
+        <w:t xml:space="preserve">Success rates measured over 512 evaluation episodes (64 envs): lift success = cube raised &gt; 0.1 m above the table; goal-reach = lifted and within 1 cm of the commanded goal. ‡ Cost λ (the Lagrangian dual variable) exists only for the constrained agent — plain PPO has no constraint, hence N/A. Both agents log the per-step safety cost (safety/cost_total) on the same 0.045 manipulability floor. † Monitored constraints, inactive by construction in this tabletop workspace: the arm never nears its joint limits (baseline min clearance ≥ 1.39 rad) or the table (min link height ≥ 0.125 m), so both agents record a 0.0 violation rate. Reported for completeness.</w:t>
       </w:r>
     </w:p>
     <w:sectPr>

</xml_diff>